<commit_message>
updates to notes for RG
</commit_message>
<xml_diff>
--- a/docs/notes_10_23_26.docx
+++ b/docs/notes_10_23_26.docx
@@ -14,6 +14,9 @@
     </w:p>
     <w:p>
       <w:r>
+        <w:rPr>
+          <w:noProof/>
+        </w:rPr>
         <w:drawing>
           <wp:inline distT="0" distB="0" distL="0" distR="0" wp14:anchorId="619DC372" wp14:editId="57D809E7">
             <wp:extent cx="5943600" cy="3044825"/>
@@ -81,12 +84,34 @@
     </w:p>
     <w:p>
       <w:r>
-        <w:t xml:space="preserve">The goal of this experiment is to see where in OpenVLA information is compressed. By measuring TDNV across transformer layers, we can track how the model progressively encodes and transforms task information throughout its architecture (from your and Jiachen's paper, "From Compression to Expression: A Layerwise Analysis of In-Context Learning". </w:t>
-      </w:r>
-    </w:p>
-    <w:p>
-      <w:r>
-        <w:t> </w:t>
+        <w:t>The goal of this experiment is to see where in OpenVLA information is compressed. By measuring TDNV across transformer layers, we can track how the model progressively encodes and transforms task information throughout its architecture (from your and Jiachen's paper, "From Compression to Expression: A Layerwise Analysis of In-Context Learning"</w:t>
+      </w:r>
+      <w:r>
+        <w:t>)</w:t>
+      </w:r>
+      <w:r>
+        <w:t xml:space="preserve">. </w:t>
+      </w:r>
+      <w:r>
+        <w:br/>
+        <w:t xml:space="preserve">Model: </w:t>
+      </w:r>
+      <w:r>
+        <w:t>openvla-7b-finetuned-libero-spatial</w:t>
+      </w:r>
+    </w:p>
+    <w:p>
+      <w:r>
+        <w:t>Analyzed hidden states at the last token “</w:t>
+      </w:r>
+      <w:r>
+        <w:rPr>
+          <w:rFonts w:ascii="Cambria Math" w:hAnsi="Cambria Math" w:cs="Cambria Math"/>
+        </w:rPr>
+        <w:t>▁</w:t>
+      </w:r>
+      <w:r>
+        <w:t xml:space="preserve">”, which predicts the first action token. </w:t>
       </w:r>
     </w:p>
     <w:p>
@@ -101,6 +126,9 @@
     </w:p>
     <w:p>
       <w:r>
+        <w:rPr>
+          <w:noProof/>
+        </w:rPr>
         <w:drawing>
           <wp:inline distT="0" distB="0" distL="0" distR="0" wp14:anchorId="7C5FCE0B" wp14:editId="7468C7F1">
             <wp:extent cx="4019550" cy="609600"/>
@@ -158,6 +186,9 @@
     </w:p>
     <w:p>
       <w:r>
+        <w:rPr>
+          <w:noProof/>
+        </w:rPr>
         <w:lastRenderedPageBreak/>
         <w:drawing>
           <wp:inline distT="0" distB="0" distL="0" distR="0" wp14:anchorId="02706FD7" wp14:editId="6FE2CE65">
@@ -221,6 +252,9 @@
     </w:p>
     <w:p>
       <w:r>
+        <w:rPr>
+          <w:noProof/>
+        </w:rPr>
         <w:drawing>
           <wp:inline distT="0" distB="0" distL="0" distR="0" wp14:anchorId="2E7F37B0" wp14:editId="52BE44FA">
             <wp:extent cx="3429000" cy="723900"/>
@@ -293,11 +327,17 @@
     </w:p>
     <w:p>
       <w:r>
-        <w:t>These are the 10 images used. The positions of the objects on the tables are different in each picture:</w:t>
-      </w:r>
-    </w:p>
-    <w:p>
-      <w:r>
+        <w:t xml:space="preserve">These are </w:t>
+      </w:r>
+      <w:r>
+        <w:t xml:space="preserve">the 10 images used. They vary the object positions on the table. </w:t>
+      </w:r>
+    </w:p>
+    <w:p>
+      <w:r>
+        <w:rPr>
+          <w:noProof/>
+        </w:rPr>
         <w:drawing>
           <wp:inline distT="0" distB="0" distL="0" distR="0" wp14:anchorId="618837B3" wp14:editId="6DE1C216">
             <wp:extent cx="4578350" cy="2057400"/>
@@ -355,14 +395,16 @@
     </w:p>
     <w:p>
       <w:r>
-        <w:t>Generic set (10 different tasks that make sense in every layout)</w:t>
-      </w:r>
-    </w:p>
-    <w:p>
-      <w:r>
-        <w:t> </w:t>
-      </w:r>
-    </w:p>
+        <w:t xml:space="preserve">Generic set </w:t>
+      </w:r>
+      <w:r>
+        <w:t xml:space="preserve">tasks </w:t>
+      </w:r>
+      <w:r>
+        <w:t>(10 different tasks that make sense in every layout)</w:t>
+      </w:r>
+    </w:p>
+    <w:p/>
     <w:p>
       <w:r>
         <w:t>pick up the black bowl and place it on the plate</w:t>
@@ -385,12 +427,12 @@
     </w:p>
     <w:p>
       <w:r>
+        <w:t>open the bottom drawer of the wooden cabinet</w:t>
+      </w:r>
+    </w:p>
+    <w:p>
+      <w:r>
         <w:lastRenderedPageBreak/>
-        <w:t>open the bottom drawer of the wooden cabinet</w:t>
-      </w:r>
-    </w:p>
-    <w:p>
-      <w:r>
         <w:t>open the bottom drawer and put the black bowl inside</w:t>
       </w:r>
     </w:p>
@@ -430,13 +472,53 @@
         <w:t> </w:t>
       </w:r>
     </w:p>
-    <w:p>
-      <w:r>
+    <w:p/>
+    <w:p>
+      <w:r>
+        <w:br/>
+        <w:t xml:space="preserve">I gave the model every combination of image and instruction, so I got 100 input pairs for OpenVLA. For each input, I recorded the internal state of OpenVLA at every layer at the last token. </w:t>
+      </w:r>
+      <w:r>
+        <w:t>Here is an example of the input sequence:</w:t>
+      </w:r>
+      <w:r>
+        <w:br/>
+      </w:r>
+      <w:r>
+        <w:t>“</w:t>
+      </w:r>
+      <w:r>
+        <w:t xml:space="preserve">&lt;s&gt; [img 1] [img 2] … [img 256] In: What action should the robot take to </w:t>
+      </w:r>
+      <w:r>
+        <w:t>{task}</w:t>
+      </w:r>
+      <w:r>
+        <w:t>?</w:t>
+      </w:r>
+    </w:p>
+    <w:p>
+      <w:r>
+        <w:t xml:space="preserve">Out: </w:t>
+      </w:r>
+      <w:r>
+        <w:rPr>
+          <w:rFonts w:ascii="Cambria Math" w:hAnsi="Cambria Math" w:cs="Cambria Math"/>
+        </w:rPr>
+        <w:t>▁</w:t>
+      </w:r>
+      <w:r>
+        <w:t>”</w:t>
+      </w:r>
+      <w:r>
+        <w:rPr>
+          <w:noProof/>
+        </w:rPr>
         <w:drawing>
-          <wp:inline distT="0" distB="0" distL="0" distR="0" wp14:anchorId="41CDB9ED" wp14:editId="46D82A76">
-            <wp:extent cx="4572000" cy="1098550"/>
-            <wp:effectExtent l="0" t="0" r="0" b="6350"/>
-            <wp:docPr id="2085777123" name="Picture 13"/>
+          <wp:inline distT="0" distB="0" distL="0" distR="0" wp14:anchorId="06872F08" wp14:editId="698CB257">
+            <wp:extent cx="5943600" cy="2362200"/>
+            <wp:effectExtent l="0" t="0" r="0" b="0"/>
+            <wp:docPr id="1934492633" name="Picture 1"/>
             <wp:cNvGraphicFramePr>
               <a:graphicFrameLocks xmlns:a="http://schemas.openxmlformats.org/drawingml/2006/main" noChangeAspect="1"/>
             </wp:cNvGraphicFramePr>
@@ -444,10 +526,8 @@
               <a:graphicData uri="http://schemas.openxmlformats.org/drawingml/2006/picture">
                 <pic:pic xmlns:pic="http://schemas.openxmlformats.org/drawingml/2006/picture">
                   <pic:nvPicPr>
-                    <pic:cNvPr id="0" name="Picture 51"/>
-                    <pic:cNvPicPr>
-                      <a:picLocks noChangeAspect="1" noChangeArrowheads="1"/>
-                    </pic:cNvPicPr>
+                    <pic:cNvPr id="1934492633" name="Picture 1934492633"/>
+                    <pic:cNvPicPr/>
                   </pic:nvPicPr>
                   <pic:blipFill>
                     <a:blip r:embed="rId10" cstate="print">
@@ -457,23 +537,18 @@
                         </a:ext>
                       </a:extLst>
                     </a:blip>
-                    <a:srcRect/>
                     <a:stretch>
                       <a:fillRect/>
                     </a:stretch>
                   </pic:blipFill>
-                  <pic:spPr bwMode="auto">
+                  <pic:spPr>
                     <a:xfrm>
                       <a:off x="0" y="0"/>
-                      <a:ext cx="4572000" cy="1098550"/>
+                      <a:ext cx="5943600" cy="2362200"/>
                     </a:xfrm>
                     <a:prstGeom prst="rect">
                       <a:avLst/>
                     </a:prstGeom>
-                    <a:noFill/>
-                    <a:ln>
-                      <a:noFill/>
-                    </a:ln>
                   </pic:spPr>
                 </pic:pic>
               </a:graphicData>
@@ -484,17 +559,35 @@
     </w:p>
     <w:p>
       <w:r>
-        <w:br/>
-        <w:t>I gave the model every combination of image and instruction, so I got 100 input pairs for OpenVLA. For each input, I recorded the internal state of OpenVLA at every layer at the last token. In the first experiment, I measured TDNV by separating by image: 10 groups of points in embedding space, each group was for 1 image, 10 instructions.</w:t>
-      </w:r>
-    </w:p>
-    <w:p>
-      <w:r>
+        <w:t xml:space="preserve">In figure above and </w:t>
+      </w:r>
+      <w:r>
+        <w:t xml:space="preserve">the </w:t>
+      </w:r>
+      <w:r>
+        <w:t xml:space="preserve">2 figures below, I used PCA to show the point groups in embedding space, reduced to 2 dimensions so we can see them intuitively. </w:t>
+      </w:r>
+    </w:p>
+    <w:p>
+      <w:r>
+        <w:lastRenderedPageBreak/>
+        <w:t>In the first experiment, I measured TDNV by separating by image: 10 groups of points in embedding space, each group was for 1 image, 10 instructions.</w:t>
+      </w:r>
+      <w:r>
+        <w:rPr>
+          <w:noProof/>
+        </w:rPr>
+        <w:t xml:space="preserve"> </w:t>
+      </w:r>
+      <w:r>
+        <w:rPr>
+          <w:noProof/>
+        </w:rPr>
         <w:drawing>
-          <wp:inline distT="0" distB="0" distL="0" distR="0" wp14:anchorId="0C628228" wp14:editId="7AF0DF95">
-            <wp:extent cx="1981200" cy="2152650"/>
-            <wp:effectExtent l="0" t="0" r="0" b="0"/>
-            <wp:docPr id="499808216" name="Picture 12"/>
+          <wp:inline distT="0" distB="0" distL="0" distR="0" wp14:anchorId="5A6E7C21" wp14:editId="5B9CE131">
+            <wp:extent cx="5120217" cy="6400271"/>
+            <wp:effectExtent l="0" t="0" r="4445" b="635"/>
+            <wp:docPr id="71334335" name="Picture 3"/>
             <wp:cNvGraphicFramePr>
               <a:graphicFrameLocks xmlns:a="http://schemas.openxmlformats.org/drawingml/2006/main" noChangeAspect="1"/>
             </wp:cNvGraphicFramePr>
@@ -502,10 +595,8 @@
               <a:graphicData uri="http://schemas.openxmlformats.org/drawingml/2006/picture">
                 <pic:pic xmlns:pic="http://schemas.openxmlformats.org/drawingml/2006/picture">
                   <pic:nvPicPr>
-                    <pic:cNvPr id="0" name="Picture 52"/>
-                    <pic:cNvPicPr>
-                      <a:picLocks noChangeAspect="1" noChangeArrowheads="1"/>
-                    </pic:cNvPicPr>
+                    <pic:cNvPr id="71334335" name="Picture 71334335"/>
+                    <pic:cNvPicPr/>
                   </pic:nvPicPr>
                   <pic:blipFill>
                     <a:blip r:embed="rId11">
@@ -515,23 +606,18 @@
                         </a:ext>
                       </a:extLst>
                     </a:blip>
-                    <a:srcRect/>
                     <a:stretch>
                       <a:fillRect/>
                     </a:stretch>
                   </pic:blipFill>
-                  <pic:spPr bwMode="auto">
+                  <pic:spPr>
                     <a:xfrm>
                       <a:off x="0" y="0"/>
-                      <a:ext cx="1981200" cy="2152650"/>
+                      <a:ext cx="5120217" cy="6400271"/>
                     </a:xfrm>
                     <a:prstGeom prst="rect">
                       <a:avLst/>
                     </a:prstGeom>
-                    <a:noFill/>
-                    <a:ln>
-                      <a:noFill/>
-                    </a:ln>
                   </pic:spPr>
                 </pic:pic>
               </a:graphicData>
@@ -540,19 +626,18 @@
         </w:drawing>
       </w:r>
     </w:p>
-    <w:p>
-      <w:r>
-        <w:t>In the second experiment, I measured TDNV by separating by instruction: 10 groups of points in embedding space, each group was for 1 instruction, 10 images.</w:t>
-      </w:r>
-    </w:p>
-    <w:p>
-      <w:r>
+    <w:p/>
+    <w:p>
+      <w:r>
+        <w:rPr>
+          <w:noProof/>
+        </w:rPr>
         <w:lastRenderedPageBreak/>
         <w:drawing>
-          <wp:inline distT="0" distB="0" distL="0" distR="0" wp14:anchorId="3A27EFD4" wp14:editId="5A94AB49">
-            <wp:extent cx="1657350" cy="1657350"/>
-            <wp:effectExtent l="0" t="0" r="0" b="0"/>
-            <wp:docPr id="677998158" name="Picture 11"/>
+          <wp:inline distT="0" distB="0" distL="0" distR="0" wp14:anchorId="3C1A064C" wp14:editId="4D70557E">
+            <wp:extent cx="5120217" cy="6400271"/>
+            <wp:effectExtent l="0" t="0" r="4445" b="635"/>
+            <wp:docPr id="650603183" name="Picture 4"/>
             <wp:cNvGraphicFramePr>
               <a:graphicFrameLocks xmlns:a="http://schemas.openxmlformats.org/drawingml/2006/main" noChangeAspect="1"/>
             </wp:cNvGraphicFramePr>
@@ -560,10 +645,8 @@
               <a:graphicData uri="http://schemas.openxmlformats.org/drawingml/2006/picture">
                 <pic:pic xmlns:pic="http://schemas.openxmlformats.org/drawingml/2006/picture">
                   <pic:nvPicPr>
-                    <pic:cNvPr id="0" name="Picture 53"/>
-                    <pic:cNvPicPr>
-                      <a:picLocks noChangeAspect="1" noChangeArrowheads="1"/>
-                    </pic:cNvPicPr>
+                    <pic:cNvPr id="650603183" name="Picture 650603183"/>
+                    <pic:cNvPicPr/>
                   </pic:nvPicPr>
                   <pic:blipFill>
                     <a:blip r:embed="rId12">
@@ -573,23 +656,18 @@
                         </a:ext>
                       </a:extLst>
                     </a:blip>
-                    <a:srcRect/>
                     <a:stretch>
                       <a:fillRect/>
                     </a:stretch>
                   </pic:blipFill>
-                  <pic:spPr bwMode="auto">
+                  <pic:spPr>
                     <a:xfrm>
                       <a:off x="0" y="0"/>
-                      <a:ext cx="1657350" cy="1657350"/>
+                      <a:ext cx="5120217" cy="6400271"/>
                     </a:xfrm>
                     <a:prstGeom prst="rect">
                       <a:avLst/>
                     </a:prstGeom>
-                    <a:noFill/>
-                    <a:ln>
-                      <a:noFill/>
-                    </a:ln>
                   </pic:spPr>
                 </pic:pic>
               </a:graphicData>
@@ -597,34 +675,25 @@
           </wp:inline>
         </w:drawing>
       </w:r>
-    </w:p>
-    <w:p>
-      <w:r>
+      <w:r>
+        <w:t>In the second experiment, I measured TDNV by separating by instruction: 10 groups of points in embedding space, each group was for 1 instruction, 10 images.</w:t>
+      </w:r>
+    </w:p>
+    <w:p/>
+    <w:p>
+      <w:r>
+        <w:lastRenderedPageBreak/>
         <w:t> </w:t>
       </w:r>
-    </w:p>
-    <w:p>
-      <w:r>
-        <w:t>Lower TDNV -&gt; tight, separated groups of points</w:t>
-      </w:r>
-    </w:p>
-    <w:p>
-      <w:r>
-        <w:t> </w:t>
-      </w:r>
-    </w:p>
-    <w:p>
-      <w:r>
-        <w:t>Results:</w:t>
-      </w:r>
-    </w:p>
-    <w:p>
-      <w:r>
+      <w:r>
+        <w:rPr>
+          <w:noProof/>
+        </w:rPr>
         <w:drawing>
-          <wp:inline distT="0" distB="0" distL="0" distR="0" wp14:anchorId="292873CE" wp14:editId="03F0C592">
-            <wp:extent cx="4572000" cy="2743200"/>
-            <wp:effectExtent l="0" t="0" r="0" b="0"/>
-            <wp:docPr id="1802645175" name="Picture 10"/>
+          <wp:inline distT="0" distB="0" distL="0" distR="0" wp14:anchorId="70D54577" wp14:editId="02828FE5">
+            <wp:extent cx="5120217" cy="6400271"/>
+            <wp:effectExtent l="0" t="0" r="4445" b="635"/>
+            <wp:docPr id="1435489459" name="Picture 2"/>
             <wp:cNvGraphicFramePr>
               <a:graphicFrameLocks xmlns:a="http://schemas.openxmlformats.org/drawingml/2006/main" noChangeAspect="1"/>
             </wp:cNvGraphicFramePr>
@@ -632,36 +701,29 @@
               <a:graphicData uri="http://schemas.openxmlformats.org/drawingml/2006/picture">
                 <pic:pic xmlns:pic="http://schemas.openxmlformats.org/drawingml/2006/picture">
                   <pic:nvPicPr>
-                    <pic:cNvPr id="0" name="Picture 54"/>
-                    <pic:cNvPicPr>
-                      <a:picLocks noChangeAspect="1" noChangeArrowheads="1"/>
-                    </pic:cNvPicPr>
+                    <pic:cNvPr id="1435489459" name="Picture 1435489459"/>
+                    <pic:cNvPicPr/>
                   </pic:nvPicPr>
                   <pic:blipFill>
-                    <a:blip r:embed="rId13" cstate="print">
+                    <a:blip r:embed="rId13">
                       <a:extLst>
                         <a:ext uri="{28A0092B-C50C-407E-A947-70E740481C1C}">
                           <a14:useLocalDpi xmlns:a14="http://schemas.microsoft.com/office/drawing/2010/main" val="0"/>
                         </a:ext>
                       </a:extLst>
                     </a:blip>
-                    <a:srcRect/>
                     <a:stretch>
                       <a:fillRect/>
                     </a:stretch>
                   </pic:blipFill>
-                  <pic:spPr bwMode="auto">
+                  <pic:spPr>
                     <a:xfrm>
                       <a:off x="0" y="0"/>
-                      <a:ext cx="4572000" cy="2743200"/>
+                      <a:ext cx="5120217" cy="6400271"/>
                     </a:xfrm>
                     <a:prstGeom prst="rect">
                       <a:avLst/>
                     </a:prstGeom>
-                    <a:noFill/>
-                    <a:ln>
-                      <a:noFill/>
-                    </a:ln>
                   </pic:spPr>
                 </pic:pic>
               </a:graphicData>
@@ -672,7 +734,97 @@
     </w:p>
     <w:p>
       <w:r>
+        <w:t>Lower TDNV -&gt; tight, separated groups of points</w:t>
+      </w:r>
+    </w:p>
+    <w:p>
+      <w:r>
         <w:t> </w:t>
+      </w:r>
+    </w:p>
+    <w:p>
+      <w:r>
+        <w:t>Results:</w:t>
+      </w:r>
+    </w:p>
+    <w:p>
+      <w:r>
+        <w:lastRenderedPageBreak/>
+        <w:drawing>
+          <wp:inline distT="0" distB="0" distL="0" distR="0" wp14:anchorId="3EAE97D3" wp14:editId="739B9057">
+            <wp:extent cx="5943600" cy="3566160"/>
+            <wp:effectExtent l="0" t="0" r="0" b="0"/>
+            <wp:docPr id="904405421" name="Picture 1"/>
+            <wp:cNvGraphicFramePr>
+              <a:graphicFrameLocks xmlns:a="http://schemas.openxmlformats.org/drawingml/2006/main" noChangeAspect="1"/>
+            </wp:cNvGraphicFramePr>
+            <a:graphic xmlns:a="http://schemas.openxmlformats.org/drawingml/2006/main">
+              <a:graphicData uri="http://schemas.openxmlformats.org/drawingml/2006/picture">
+                <pic:pic xmlns:pic="http://schemas.openxmlformats.org/drawingml/2006/picture">
+                  <pic:nvPicPr>
+                    <pic:cNvPr id="904405421" name=""/>
+                    <pic:cNvPicPr/>
+                  </pic:nvPicPr>
+                  <pic:blipFill>
+                    <a:blip r:embed="rId14"/>
+                    <a:stretch>
+                      <a:fillRect/>
+                    </a:stretch>
+                  </pic:blipFill>
+                  <pic:spPr>
+                    <a:xfrm>
+                      <a:off x="0" y="0"/>
+                      <a:ext cx="5943600" cy="3566160"/>
+                    </a:xfrm>
+                    <a:prstGeom prst="rect">
+                      <a:avLst/>
+                    </a:prstGeom>
+                  </pic:spPr>
+                </pic:pic>
+              </a:graphicData>
+            </a:graphic>
+          </wp:inline>
+        </w:drawing>
+      </w:r>
+    </w:p>
+    <w:p>
+      <w:r>
+        <w:t>“Random groups of 10” :</w:t>
+      </w:r>
+      <w:r>
+        <w:t> </w:t>
+      </w:r>
+      <w:r>
+        <w:t xml:space="preserve"> Take the same 100 points and deal them into 10 random groups of 10. Each group now mixes every image and every instruction, so it's as spread out as the whole cloud. Its center is the average of 10 random points, which lands near the middle of the cloud, so all 10 centers sit close together. Wide groups with nearby centers give a </w:t>
+      </w:r>
+      <w:r>
+        <w:rPr>
+          <w:b/>
+          <w:bCs/>
+        </w:rPr>
+        <w:t>high</w:t>
+      </w:r>
+      <w:r>
+        <w:t xml:space="preserve"> TDNV: about </w:t>
+      </w:r>
+      <w:r>
+        <w:rPr>
+          <w:b/>
+          <w:bCs/>
+        </w:rPr>
+        <w:t>400–600</w:t>
+      </w:r>
+      <w:r>
+        <w:t xml:space="preserve"> for groups of 10. </w:t>
+      </w:r>
+      <w:r>
+        <w:t xml:space="preserve">I included this so we can show a baseline. </w:t>
+      </w:r>
+      <w:r>
+        <w:t>Grouped by image is 15× below chance at L3; grouped by instruction is 86× below chance at L7.</w:t>
+      </w:r>
+      <w:r>
+        <w:br/>
       </w:r>
     </w:p>
     <w:p>
@@ -688,7 +840,13 @@
         </w:numPr>
       </w:pPr>
       <w:r>
-        <w:t>Loosely organized around the image at early layers and late layers, with the lowest TDNV of 0.43 at layer 3 and 0.7-1.0 in later layers</w:t>
+        <w:t xml:space="preserve">Loosely organized around the image at early layers and late layers, with the lowest TDNV of </w:t>
+      </w:r>
+      <w:r>
+        <w:t>32.3</w:t>
+      </w:r>
+      <w:r>
+        <w:t xml:space="preserve"> at layer 3 </w:t>
       </w:r>
     </w:p>
     <w:p>
@@ -704,10 +862,73 @@
         </w:numPr>
       </w:pPr>
       <w:r>
-        <w:t>Strongly organized by the instruction at layer 7 with TDNV 0.068</w:t>
-      </w:r>
-    </w:p>
-    <w:p/>
+        <w:t xml:space="preserve">Strongly organized by the instruction at layer 7 with TDNV </w:t>
+      </w:r>
+      <w:r>
+        <w:t>6.47</w:t>
+      </w:r>
+    </w:p>
+    <w:p>
+      <w:r>
+        <w:t xml:space="preserve">the instruction curve follows the same compression-then-expression shape, falling to its minimum at L7 and rising after. One difference to point out is that the paper's minimum comes mid-network (about L17), while </w:t>
+      </w:r>
+      <w:r>
+        <w:t>OpenVLA’s</w:t>
+      </w:r>
+      <w:r>
+        <w:t xml:space="preserve"> comes early (L7 of 32).</w:t>
+      </w:r>
+      <w:r>
+        <w:br/>
+        <w:t xml:space="preserve">Looking at the layer 7, colored by instruction figure, we see that instructions that refer to “black bowls” are close together, instructions that refer to the “drawer” look like they fall on a direction/line, </w:t>
+      </w:r>
+      <w:r>
+        <w:t xml:space="preserve">instructions that mention the “stove” are close, and instructions that </w:t>
+      </w:r>
+      <w:r>
+        <w:lastRenderedPageBreak/>
+        <w:t>mention “plate” are close. Looking at layer 31, colored by image, layouts 0 and 8 are very close, and we see that those layouts are similar in their images regarding bowl positions. The centers of groups in layer 3, colored by image, are closer together</w:t>
+      </w:r>
+    </w:p>
+    <w:p>
+      <w:r>
+        <w:drawing>
+          <wp:inline distT="0" distB="0" distL="0" distR="0" wp14:anchorId="1E877A77" wp14:editId="4E71E7E5">
+            <wp:extent cx="4159464" cy="1987652"/>
+            <wp:effectExtent l="0" t="0" r="0" b="0"/>
+            <wp:docPr id="84295096" name="Picture 1"/>
+            <wp:cNvGraphicFramePr>
+              <a:graphicFrameLocks xmlns:a="http://schemas.openxmlformats.org/drawingml/2006/main" noChangeAspect="1"/>
+            </wp:cNvGraphicFramePr>
+            <a:graphic xmlns:a="http://schemas.openxmlformats.org/drawingml/2006/main">
+              <a:graphicData uri="http://schemas.openxmlformats.org/drawingml/2006/picture">
+                <pic:pic xmlns:pic="http://schemas.openxmlformats.org/drawingml/2006/picture">
+                  <pic:nvPicPr>
+                    <pic:cNvPr id="84295096" name=""/>
+                    <pic:cNvPicPr/>
+                  </pic:nvPicPr>
+                  <pic:blipFill>
+                    <a:blip r:embed="rId15"/>
+                    <a:stretch>
+                      <a:fillRect/>
+                    </a:stretch>
+                  </pic:blipFill>
+                  <pic:spPr>
+                    <a:xfrm>
+                      <a:off x="0" y="0"/>
+                      <a:ext cx="4159464" cy="1987652"/>
+                    </a:xfrm>
+                    <a:prstGeom prst="rect">
+                      <a:avLst/>
+                    </a:prstGeom>
+                  </pic:spPr>
+                </pic:pic>
+              </a:graphicData>
+            </a:graphic>
+          </wp:inline>
+        </w:drawing>
+      </w:r>
+    </w:p>
     <w:sectPr>
       <w:pgSz w:w="12240" w:h="15840"/>
       <w:pgMar w:top="1440" w:right="1440" w:bottom="1440" w:left="1440" w:header="720" w:footer="720" w:gutter="0"/>
@@ -1943,6 +2164,36 @@
       <w:spacing w:val="5"/>
     </w:rPr>
   </w:style>
+  <w:style w:type="paragraph" w:styleId="HTMLPreformatted">
+    <w:name w:val="HTML Preformatted"/>
+    <w:basedOn w:val="Normal"/>
+    <w:link w:val="HTMLPreformattedChar"/>
+    <w:uiPriority w:val="99"/>
+    <w:semiHidden/>
+    <w:unhideWhenUsed/>
+    <w:rsid w:val="002721AD"/>
+    <w:pPr>
+      <w:spacing w:after="0" w:line="240" w:lineRule="auto"/>
+    </w:pPr>
+    <w:rPr>
+      <w:rFonts w:ascii="Consolas" w:hAnsi="Consolas"/>
+      <w:sz w:val="20"/>
+      <w:szCs w:val="20"/>
+    </w:rPr>
+  </w:style>
+  <w:style w:type="character" w:customStyle="1" w:styleId="HTMLPreformattedChar">
+    <w:name w:val="HTML Preformatted Char"/>
+    <w:basedOn w:val="DefaultParagraphFont"/>
+    <w:link w:val="HTMLPreformatted"/>
+    <w:uiPriority w:val="99"/>
+    <w:semiHidden/>
+    <w:rsid w:val="002721AD"/>
+    <w:rPr>
+      <w:rFonts w:ascii="Consolas" w:hAnsi="Consolas"/>
+      <w:sz w:val="20"/>
+      <w:szCs w:val="20"/>
+    </w:rPr>
+  </w:style>
 </w:styles>
 </file>
 

</xml_diff>